<commit_message>
Reversing OLS and testing
reversing the OLS and Plotting the model with the best performance and interpreting
</commit_message>
<xml_diff>
--- a/Questions   As requested by the Supervisor.docx
+++ b/Questions   As requested by the Supervisor.docx
@@ -3,61 +3,48 @@
 <w:document xmlns:wpc="http://schemas.microsoft.com/office/word/2010/wordprocessingCanvas" xmlns:cx="http://schemas.microsoft.com/office/drawing/2014/chartex" xmlns:cx1="http://schemas.microsoft.com/office/drawing/2015/9/8/chartex" xmlns:cx2="http://schemas.microsoft.com/office/drawing/2015/10/21/chartex" xmlns:cx3="http://schemas.microsoft.com/office/drawing/2016/5/9/chartex" xmlns:cx4="http://schemas.microsoft.com/office/drawing/2016/5/10/chartex" xmlns:cx5="http://schemas.microsoft.com/office/drawing/2016/5/11/chartex" xmlns:cx6="http://schemas.microsoft.com/office/drawing/2016/5/12/chartex" xmlns:cx7="http://schemas.microsoft.com/office/drawing/2016/5/13/chartex" xmlns:cx8="http://schemas.microsoft.com/office/drawing/2016/5/14/chartex" xmlns:mc="http://schemas.openxmlformats.org/markup-compatibility/2006" xmlns:aink="http://schemas.microsoft.com/office/drawing/2016/ink" xmlns:am3d="http://schemas.microsoft.com/office/drawing/2017/model3d" xmlns:o="urn:schemas-microsoft-com:office:office" xmlns:oel="http://schemas.microsoft.com/office/2019/extlst" xmlns:r="http://schemas.openxmlformats.org/officeDocument/2006/relationships" xmlns:m="http://schemas.openxmlformats.org/officeDocument/2006/math" xmlns:v="urn:schemas-microsoft-com:vml" xmlns:wp14="http://schemas.microsoft.com/office/word/2010/wordprocessingDrawing" xmlns:wp="http://schemas.openxmlformats.org/drawingml/2006/wordprocessingDrawing" xmlns:w10="urn:schemas-microsoft-com:office:word" xmlns:w="http://schemas.openxmlformats.org/wordprocessingml/2006/main" xmlns:w14="http://schemas.microsoft.com/office/word/2010/wordml" xmlns:w15="http://schemas.microsoft.com/office/word/2012/wordml" xmlns:w16cex="http://schemas.microsoft.com/office/word/2018/wordml/cex" xmlns:w16cid="http://schemas.microsoft.com/office/word/2016/wordml/cid" xmlns:w16="http://schemas.microsoft.com/office/word/2018/wordml" xmlns:w16du="http://schemas.microsoft.com/office/word/2023/wordml/word16du" xmlns:w16sdtdh="http://schemas.microsoft.com/office/word/2020/wordml/sdtdatahash" xmlns:w16sdtfl="http://schemas.microsoft.com/office/word/2024/wordml/sdtformatlock" xmlns:w16se="http://schemas.microsoft.com/office/word/2015/wordml/symex" xmlns:wpg="http://schemas.microsoft.com/office/word/2010/wordprocessingGroup" xmlns:wpi="http://schemas.microsoft.com/office/word/2010/wordprocessingInk" xmlns:wne="http://schemas.microsoft.com/office/word/2006/wordml" xmlns:wps="http://schemas.microsoft.com/office/word/2010/wordprocessingShape" mc:Ignorable="w14 w15 w16se w16cid w16 w16cex w16sdtdh w16sdtfl w16du wp14">
   <w:body>
     <w:p>
-      <w:pPr>
-        <w:rPr>
-          <w:rFonts w:ascii="Times New Roman" w:hAnsi="Times New Roman" w:cs="Times New Roman"/>
-        </w:rPr>
-      </w:pPr>
       <w:r>
         <w:rPr>
           <w:rFonts w:ascii="Times New Roman" w:hAnsi="Times New Roman" w:cs="Times New Roman"/>
         </w:rPr>
-        <w:t>Why do you have multiple rows of data per player per season</w:t>
+        <w:t>Complete grid search for random forest and SVR.  Tune C and gamma for the SVR</w:t>
       </w:r>
       <w:r>
         <w:rPr>
           <w:rFonts w:ascii="Times New Roman" w:hAnsi="Times New Roman" w:cs="Times New Roman"/>
         </w:rPr>
         <w:br/>
-        <w:t>- What is the average number of seasons that a player plays?</w:t>
+        <w:t>- Fix your OLS regression because you have an R2 of 100%.  Be consistent in the features that you use.  You can use the same train test split everywhere.</w:t>
       </w:r>
       <w:r>
         <w:rPr>
           <w:rFonts w:ascii="Times New Roman" w:hAnsi="Times New Roman" w:cs="Times New Roman"/>
         </w:rPr>
         <w:br/>
-        <w:t>- How many players and how many seasons for each player plays would give you an idea of how far back you can go.</w:t>
+        <w:t>- Once you completed grid search for Random Forest, Lasso, SVR, Decision Tree</w:t>
       </w:r>
       <w:r>
         <w:rPr>
           <w:rFonts w:ascii="Times New Roman" w:hAnsi="Times New Roman" w:cs="Times New Roman"/>
         </w:rPr>
         <w:br/>
-        <w:t>- Send me your data and your workbooks.</w:t>
+        <w:t>- Make sure you are consistent with your loss function for each grid search</w:t>
       </w:r>
       <w:r>
         <w:rPr>
           <w:rFonts w:ascii="Times New Roman" w:hAnsi="Times New Roman" w:cs="Times New Roman"/>
         </w:rPr>
         <w:br/>
-        <w:t xml:space="preserve">- Create a </w:t>
+        <w:t>- Plot the average cross validation test score for the best performing parameters and the standard deviation</w:t>
       </w:r>
-      <w:proofErr w:type="spellStart"/>
       <w:r>
         <w:rPr>
           <w:rFonts w:ascii="Times New Roman" w:hAnsi="Times New Roman" w:cs="Times New Roman"/>
         </w:rPr>
-        <w:t>github</w:t>
-      </w:r>
-      <w:proofErr w:type="spellEnd"/>
-      <w:r>
-        <w:rPr>
-          <w:rFonts w:ascii="Times New Roman" w:hAnsi="Times New Roman" w:cs="Times New Roman"/>
-        </w:rPr>
-        <w:t xml:space="preserve"> repo name it 2026_01_ia690_jimu_capstone and push all your code to that repo</w:t>
+        <w:br/>
+        <w:t>- Complete backward selection for your OLS model until all you p-values are less than 0.05</w:t>
       </w:r>
     </w:p>
-    <w:p/>
     <w:sectPr>
       <w:pgSz w:w="12240" w:h="15840"/>
       <w:pgMar w:top="1440" w:right="1440" w:bottom="1440" w:left="1440" w:header="720" w:footer="720" w:gutter="0"/>

</xml_diff>

<commit_message>
TensorFlow and Table of contents
taking all the model results and best overall performance
</commit_message>
<xml_diff>
--- a/Questions   As requested by the Supervisor.docx
+++ b/Questions   As requested by the Supervisor.docx
@@ -3,46 +3,93 @@
 <w:document xmlns:wpc="http://schemas.microsoft.com/office/word/2010/wordprocessingCanvas" xmlns:cx="http://schemas.microsoft.com/office/drawing/2014/chartex" xmlns:cx1="http://schemas.microsoft.com/office/drawing/2015/9/8/chartex" xmlns:cx2="http://schemas.microsoft.com/office/drawing/2015/10/21/chartex" xmlns:cx3="http://schemas.microsoft.com/office/drawing/2016/5/9/chartex" xmlns:cx4="http://schemas.microsoft.com/office/drawing/2016/5/10/chartex" xmlns:cx5="http://schemas.microsoft.com/office/drawing/2016/5/11/chartex" xmlns:cx6="http://schemas.microsoft.com/office/drawing/2016/5/12/chartex" xmlns:cx7="http://schemas.microsoft.com/office/drawing/2016/5/13/chartex" xmlns:cx8="http://schemas.microsoft.com/office/drawing/2016/5/14/chartex" xmlns:mc="http://schemas.openxmlformats.org/markup-compatibility/2006" xmlns:aink="http://schemas.microsoft.com/office/drawing/2016/ink" xmlns:am3d="http://schemas.microsoft.com/office/drawing/2017/model3d" xmlns:o="urn:schemas-microsoft-com:office:office" xmlns:oel="http://schemas.microsoft.com/office/2019/extlst" xmlns:r="http://schemas.openxmlformats.org/officeDocument/2006/relationships" xmlns:m="http://schemas.openxmlformats.org/officeDocument/2006/math" xmlns:v="urn:schemas-microsoft-com:vml" xmlns:wp14="http://schemas.microsoft.com/office/word/2010/wordprocessingDrawing" xmlns:wp="http://schemas.openxmlformats.org/drawingml/2006/wordprocessingDrawing" xmlns:w10="urn:schemas-microsoft-com:office:word" xmlns:w="http://schemas.openxmlformats.org/wordprocessingml/2006/main" xmlns:w14="http://schemas.microsoft.com/office/word/2010/wordml" xmlns:w15="http://schemas.microsoft.com/office/word/2012/wordml" xmlns:w16cex="http://schemas.microsoft.com/office/word/2018/wordml/cex" xmlns:w16cid="http://schemas.microsoft.com/office/word/2016/wordml/cid" xmlns:w16="http://schemas.microsoft.com/office/word/2018/wordml" xmlns:w16du="http://schemas.microsoft.com/office/word/2023/wordml/word16du" xmlns:w16sdtdh="http://schemas.microsoft.com/office/word/2020/wordml/sdtdatahash" xmlns:w16sdtfl="http://schemas.microsoft.com/office/word/2024/wordml/sdtformatlock" xmlns:w16se="http://schemas.microsoft.com/office/word/2015/wordml/symex" xmlns:wpg="http://schemas.microsoft.com/office/word/2010/wordprocessingGroup" xmlns:wpi="http://schemas.microsoft.com/office/word/2010/wordprocessingInk" xmlns:wne="http://schemas.microsoft.com/office/word/2006/wordml" xmlns:wps="http://schemas.microsoft.com/office/word/2010/wordprocessingShape" mc:Ignorable="w14 w15 w16se w16cid w16 w16cex w16sdtdh w16sdtfl w16du wp14">
   <w:body>
     <w:p>
+      <w:pPr>
+        <w:rPr>
+          <w:rFonts w:ascii="Times New Roman" w:hAnsi="Times New Roman" w:cs="Times New Roman"/>
+        </w:rPr>
+      </w:pPr>
       <w:r>
         <w:rPr>
           <w:rFonts w:ascii="Times New Roman" w:hAnsi="Times New Roman" w:cs="Times New Roman"/>
         </w:rPr>
-        <w:t>Complete grid search for random forest and SVR.  Tune C and gamma for the SVR</w:t>
+        <w:t xml:space="preserve">You had the right idea.  Your top 3 variables selected match your largest LASSO coefficients.  Show the variables remaining from backward selection (fix Backward selection removed:) </w:t>
+      </w:r>
+      <w:proofErr w:type="spellStart"/>
+      <w:r>
+        <w:rPr>
+          <w:rFonts w:ascii="Times New Roman" w:hAnsi="Times New Roman" w:cs="Times New Roman"/>
+        </w:rPr>
+        <w:t>along side</w:t>
+      </w:r>
+      <w:proofErr w:type="spellEnd"/>
+      <w:r>
+        <w:rPr>
+          <w:rFonts w:ascii="Times New Roman" w:hAnsi="Times New Roman" w:cs="Times New Roman"/>
+        </w:rPr>
+        <w:t xml:space="preserve"> the LASSO coefficients sorted by magnitude (absolute value)</w:t>
       </w:r>
       <w:r>
         <w:rPr>
           <w:rFonts w:ascii="Times New Roman" w:hAnsi="Times New Roman" w:cs="Times New Roman"/>
         </w:rPr>
         <w:br/>
-        <w:t>- Fix your OLS regression because you have an R2 of 100%.  Be consistent in the features that you use.  You can use the same train test split everywhere.</w:t>
+        <w:t xml:space="preserve">- Try fitting a network with </w:t>
+      </w:r>
+      <w:proofErr w:type="spellStart"/>
+      <w:r>
+        <w:rPr>
+          <w:rFonts w:ascii="Times New Roman" w:hAnsi="Times New Roman" w:cs="Times New Roman"/>
+        </w:rPr>
+        <w:t>tensorflow</w:t>
+      </w:r>
+      <w:proofErr w:type="spellEnd"/>
+      <w:r>
+        <w:rPr>
+          <w:rFonts w:ascii="Times New Roman" w:hAnsi="Times New Roman" w:cs="Times New Roman"/>
+        </w:rPr>
+        <w:t xml:space="preserve"> with early stopping and report the number of epochs it needed.</w:t>
       </w:r>
       <w:r>
         <w:rPr>
           <w:rFonts w:ascii="Times New Roman" w:hAnsi="Times New Roman" w:cs="Times New Roman"/>
         </w:rPr>
         <w:br/>
-        <w:t>- Once you completed grid search for Random Forest, Lasso, SVR, Decision Tree</w:t>
+      </w:r>
+    </w:p>
+    <w:p>
+      <w:r>
+        <w:rPr>
+          <w:rFonts w:ascii="Times New Roman" w:hAnsi="Times New Roman" w:cs="Times New Roman"/>
+        </w:rPr>
+        <w:t>- Start to write up your results.  Try overleaf or you could just use Google Docs.  Start to write:</w:t>
       </w:r>
       <w:r>
         <w:rPr>
           <w:rFonts w:ascii="Times New Roman" w:hAnsi="Times New Roman" w:cs="Times New Roman"/>
         </w:rPr>
         <w:br/>
-        <w:t>- Make sure you are consistent with your loss function for each grid search</w:t>
+        <w:t>- Start with a description of data provenance. You want to outline all your cleaning and preparation steps for your data from the original data source to the final used datasets</w:t>
       </w:r>
       <w:r>
         <w:rPr>
           <w:rFonts w:ascii="Times New Roman" w:hAnsi="Times New Roman" w:cs="Times New Roman"/>
         </w:rPr>
         <w:br/>
-        <w:t>- Plot the average cross validation test score for the best performing parameters and the standard deviation</w:t>
+        <w:t xml:space="preserve">- Start with a </w:t>
       </w:r>
+      <w:proofErr w:type="gramStart"/>
       <w:r>
         <w:rPr>
           <w:rFonts w:ascii="Times New Roman" w:hAnsi="Times New Roman" w:cs="Times New Roman"/>
         </w:rPr>
-        <w:br/>
-        <w:t>- Complete backward selection for your OLS model until all you p-values are less than 0.05</w:t>
+        <w:t>high level</w:t>
+      </w:r>
+      <w:proofErr w:type="gramEnd"/>
+      <w:r>
+        <w:rPr>
+          <w:rFonts w:ascii="Times New Roman" w:hAnsi="Times New Roman" w:cs="Times New Roman"/>
+        </w:rPr>
+        <w:t xml:space="preserve"> summary and outline your model results.  You should have 1 table that outlines all the models you tried.</w:t>
       </w:r>
     </w:p>
     <w:sectPr>
@@ -2335,6 +2382,7 @@
   <w:style w:type="character" w:default="1" w:styleId="DefaultParagraphFont">
     <w:name w:val="Default Paragraph Font"/>
     <w:uiPriority w:val="1"/>
+    <w:semiHidden/>
     <w:unhideWhenUsed/>
   </w:style>
   <w:style w:type="table" w:default="1" w:styleId="TableNormal">

</xml_diff>